<commit_message>
changes in Data Folder
</commit_message>
<xml_diff>
--- a/data/word/ABC ID Notice.docx
+++ b/data/word/ABC ID Notice.docx
@@ -1,6 +1,6 @@
 
 <file path=word/document.xml><?xml version="1.0" encoding="utf-8"?>
-<w:document xmlns:wpc="http://schemas.microsoft.com/office/word/2010/wordprocessingCanvas" xmlns:cx="http://schemas.microsoft.com/office/drawing/2014/chartex" xmlns:cx1="http://schemas.microsoft.com/office/drawing/2015/9/8/chartex" xmlns:cx2="http://schemas.microsoft.com/office/drawing/2015/10/21/chartex" xmlns:cx3="http://schemas.microsoft.com/office/drawing/2016/5/9/chartex" xmlns:cx4="http://schemas.microsoft.com/office/drawing/2016/5/10/chartex" xmlns:cx5="http://schemas.microsoft.com/office/drawing/2016/5/11/chartex" xmlns:cx6="http://schemas.microsoft.com/office/drawing/2016/5/12/chartex" xmlns:cx7="http://schemas.microsoft.com/office/drawing/2016/5/13/chartex" xmlns:cx8="http://schemas.microsoft.com/office/drawing/2016/5/14/chartex" xmlns:mc="http://schemas.openxmlformats.org/markup-compatibility/2006" xmlns:aink="http://schemas.microsoft.com/office/drawing/2016/ink" xmlns:am3d="http://schemas.microsoft.com/office/drawing/2017/model3d" xmlns:o="urn:schemas-microsoft-com:office:office" xmlns:r="http://schemas.openxmlformats.org/officeDocument/2006/relationships" xmlns:m="http://schemas.openxmlformats.org/officeDocument/2006/math" xmlns:v="urn:schemas-microsoft-com:vml" xmlns:wp14="http://schemas.microsoft.com/office/word/2010/wordprocessingDrawing" xmlns:wp="http://schemas.openxmlformats.org/drawingml/2006/wordprocessingDrawing" xmlns:w10="urn:schemas-microsoft-com:office:word" xmlns:w="http://schemas.openxmlformats.org/wordprocessingml/2006/main" xmlns:w14="http://schemas.microsoft.com/office/word/2010/wordml" xmlns:w15="http://schemas.microsoft.com/office/word/2012/wordml" xmlns:w16cex="http://schemas.microsoft.com/office/word/2018/wordml/cex" xmlns:w16cid="http://schemas.microsoft.com/office/word/2016/wordml/cid" xmlns:w16="http://schemas.microsoft.com/office/word/2018/wordml" xmlns:w16sdtdh="http://schemas.microsoft.com/office/word/2020/wordml/sdtdatahash" xmlns:w16se="http://schemas.microsoft.com/office/word/2015/wordml/symex" xmlns:wpg="http://schemas.microsoft.com/office/word/2010/wordprocessingGroup" xmlns:wpi="http://schemas.microsoft.com/office/word/2010/wordprocessingInk" xmlns:wne="http://schemas.microsoft.com/office/word/2006/wordml" xmlns:wps="http://schemas.microsoft.com/office/word/2010/wordprocessingShape" mc:Ignorable="w14 w15 w16se w16cid w16 w16cex w16sdtdh wp14">
+<w:document xmlns:wpc="http://schemas.microsoft.com/office/word/2010/wordprocessingCanvas" xmlns:cx="http://schemas.microsoft.com/office/drawing/2014/chartex" xmlns:cx1="http://schemas.microsoft.com/office/drawing/2015/9/8/chartex" xmlns:cx2="http://schemas.microsoft.com/office/drawing/2015/10/21/chartex" xmlns:cx3="http://schemas.microsoft.com/office/drawing/2016/5/9/chartex" xmlns:cx4="http://schemas.microsoft.com/office/drawing/2016/5/10/chartex" xmlns:cx5="http://schemas.microsoft.com/office/drawing/2016/5/11/chartex" xmlns:cx6="http://schemas.microsoft.com/office/drawing/2016/5/12/chartex" xmlns:cx7="http://schemas.microsoft.com/office/drawing/2016/5/13/chartex" xmlns:cx8="http://schemas.microsoft.com/office/drawing/2016/5/14/chartex" xmlns:mc="http://schemas.openxmlformats.org/markup-compatibility/2006" xmlns:aink="http://schemas.microsoft.com/office/drawing/2016/ink" xmlns:am3d="http://schemas.microsoft.com/office/drawing/2017/model3d" xmlns:o="urn:schemas-microsoft-com:office:office" xmlns:oel="http://schemas.microsoft.com/office/2019/extlst" xmlns:r="http://schemas.openxmlformats.org/officeDocument/2006/relationships" xmlns:m="http://schemas.openxmlformats.org/officeDocument/2006/math" xmlns:v="urn:schemas-microsoft-com:vml" xmlns:wp14="http://schemas.microsoft.com/office/word/2010/wordprocessingDrawing" xmlns:wp="http://schemas.openxmlformats.org/drawingml/2006/wordprocessingDrawing" xmlns:w10="urn:schemas-microsoft-com:office:word" xmlns:w="http://schemas.openxmlformats.org/wordprocessingml/2006/main" xmlns:w14="http://schemas.microsoft.com/office/word/2010/wordml" xmlns:w15="http://schemas.microsoft.com/office/word/2012/wordml" xmlns:w16cex="http://schemas.microsoft.com/office/word/2018/wordml/cex" xmlns:w16cid="http://schemas.microsoft.com/office/word/2016/wordml/cid" xmlns:w16="http://schemas.microsoft.com/office/word/2018/wordml" xmlns:w16du="http://schemas.microsoft.com/office/word/2023/wordml/word16du" xmlns:w16sdtdh="http://schemas.microsoft.com/office/word/2020/wordml/sdtdatahash" xmlns:w16sdtfl="http://schemas.microsoft.com/office/word/2024/wordml/sdtformatlock" xmlns:w16se="http://schemas.microsoft.com/office/word/2015/wordml/symex" xmlns:wpg="http://schemas.microsoft.com/office/word/2010/wordprocessingGroup" xmlns:wpi="http://schemas.microsoft.com/office/word/2010/wordprocessingInk" xmlns:wne="http://schemas.microsoft.com/office/word/2006/wordml" xmlns:wps="http://schemas.microsoft.com/office/word/2010/wordprocessingShape" mc:Ignorable="w14 w15 w16se w16cid w16 w16cex w16sdtdh w16sdtfl w16du wp14">
   <w:body>
     <w:p>
       <w:pPr>
@@ -124,43 +124,7 @@
           <w:sz w:val="25"/>
           <w:szCs w:val="25"/>
         </w:rPr>
-        <w:t xml:space="preserve"> that discrepancies have been identified in the data recorded on the JKBOTE portal and the Academic Bank of Credits (ABC) portal. These mismatches are causing significant inconvenience and delays in uploading and synchronizing student information on the ABC </w:t>
-      </w:r>
-      <w:r>
-        <w:rPr>
-          <w:rFonts w:ascii="Tahoma" w:hAnsi="Tahoma" w:cs="Tahoma"/>
-          <w:color w:val="1F1F1F"/>
-          <w:sz w:val="25"/>
-          <w:szCs w:val="25"/>
-        </w:rPr>
-        <w:t>portal. The</w:t>
-      </w:r>
-      <w:r>
-        <w:rPr>
-          <w:rFonts w:ascii="Tahoma" w:hAnsi="Tahoma" w:cs="Tahoma"/>
-          <w:color w:val="1F1F1F"/>
-          <w:sz w:val="25"/>
-          <w:szCs w:val="25"/>
-        </w:rPr>
-        <w:t xml:space="preserve"> Board has informed us </w:t>
-      </w:r>
-      <w:r>
-        <w:rPr>
-          <w:rFonts w:ascii="Tahoma" w:hAnsi="Tahoma" w:cs="Tahoma"/>
-          <w:color w:val="1F1F1F"/>
-          <w:sz w:val="25"/>
-          <w:szCs w:val="25"/>
-        </w:rPr>
-        <w:t>those common discrepancies</w:t>
-      </w:r>
-      <w:r>
-        <w:rPr>
-          <w:rFonts w:ascii="Tahoma" w:hAnsi="Tahoma" w:cs="Tahoma"/>
-          <w:color w:val="1F1F1F"/>
-          <w:sz w:val="25"/>
-          <w:szCs w:val="25"/>
-        </w:rPr>
-        <w:t xml:space="preserve"> include variations in the spelling of names, inconsistent dates of birth, and mismatched parentage details. We have received details from the Board indicating that some of you have mismatches in your name, gender, and/or date of birth. Furthermore, some records show mismatches in all three categories (name, gender, DOB), while for others, the record was not found at all.</w:t>
+        <w:t xml:space="preserve"> that discrepancies have been identified in the data recorded on the JKBOTE portal and the Academic Bank of Credits (ABC) portal. These mismatches are causing significant inconvenience and delays in uploading and synchronizing student information on the ABC portal. The Board has informed us those common discrepancies include variations in the spelling of names, inconsistent dates of birth, and mismatched parentage details. We have received details from the Board indicating that some of you have mismatches in your name, gender, and/or date of birth. Furthermore, some records show mismatches in all three categories (name, gender, DOB), while for others, the record was not found at all.</w:t>
       </w:r>
     </w:p>
     <w:p>
@@ -182,25 +146,7 @@
           <w:sz w:val="25"/>
           <w:szCs w:val="25"/>
         </w:rPr>
-        <w:t xml:space="preserve">It is crucial to understand that the credit transfer and other advantages of having an ABC ID are only possible when all your details match across platforms. This means your Aadhaar details and 10th class details must match, which will then ensure your DigiLocker details align with your ABC </w:t>
-      </w:r>
-      <w:r>
-        <w:rPr>
-          <w:rFonts w:ascii="Tahoma" w:hAnsi="Tahoma" w:cs="Tahoma"/>
-          <w:color w:val="1F1F1F"/>
-          <w:sz w:val="25"/>
-          <w:szCs w:val="25"/>
-        </w:rPr>
-        <w:t>ID. Therefore</w:t>
-      </w:r>
-      <w:r>
-        <w:rPr>
-          <w:rFonts w:ascii="Tahoma" w:hAnsi="Tahoma" w:cs="Tahoma"/>
-          <w:color w:val="1F1F1F"/>
-          <w:sz w:val="25"/>
-          <w:szCs w:val="25"/>
-        </w:rPr>
-        <w:t>, it is mandatory for all affected students to check their details for any mismatches and get their Aadhaar cards corrected as soon as possible.</w:t>
+        <w:t>It is crucial to understand that the credit transfer and other advantages of having an ABC ID are only possible when all your details match across platforms. This means your Aadhaar details and 10th class details must match, which will then ensure your DigiLocker details align with your ABC ID. Therefore, it is mandatory for all affected students to check their details for any mismatches and get their Aadhaar cards corrected as soon as possible.</w:t>
       </w:r>
       <w:r>
         <w:rPr>
@@ -663,7 +609,6 @@
       </w:pPr>
     </w:p>
     <w:sectPr>
-      <w:headerReference w:type="default" r:id="rId7"/>
       <w:pgSz w:w="11906" w:h="16838"/>
       <w:pgMar w:top="293" w:right="746" w:bottom="8" w:left="1276" w:header="426" w:footer="720" w:gutter="0"/>
       <w:cols w:space="720"/>
@@ -674,7 +619,7 @@
 </file>
 
 <file path=word/endnotes.xml><?xml version="1.0" encoding="utf-8"?>
-<w:endnotes xmlns:wpc="http://schemas.microsoft.com/office/word/2010/wordprocessingCanvas" xmlns:cx="http://schemas.microsoft.com/office/drawing/2014/chartex" xmlns:cx1="http://schemas.microsoft.com/office/drawing/2015/9/8/chartex" xmlns:cx2="http://schemas.microsoft.com/office/drawing/2015/10/21/chartex" xmlns:cx3="http://schemas.microsoft.com/office/drawing/2016/5/9/chartex" xmlns:cx4="http://schemas.microsoft.com/office/drawing/2016/5/10/chartex" xmlns:cx5="http://schemas.microsoft.com/office/drawing/2016/5/11/chartex" xmlns:cx6="http://schemas.microsoft.com/office/drawing/2016/5/12/chartex" xmlns:cx7="http://schemas.microsoft.com/office/drawing/2016/5/13/chartex" xmlns:cx8="http://schemas.microsoft.com/office/drawing/2016/5/14/chartex" xmlns:mc="http://schemas.openxmlformats.org/markup-compatibility/2006" xmlns:aink="http://schemas.microsoft.com/office/drawing/2016/ink" xmlns:am3d="http://schemas.microsoft.com/office/drawing/2017/model3d" xmlns:o="urn:schemas-microsoft-com:office:office" xmlns:r="http://schemas.openxmlformats.org/officeDocument/2006/relationships" xmlns:m="http://schemas.openxmlformats.org/officeDocument/2006/math" xmlns:v="urn:schemas-microsoft-com:vml" xmlns:wp14="http://schemas.microsoft.com/office/word/2010/wordprocessingDrawing" xmlns:wp="http://schemas.openxmlformats.org/drawingml/2006/wordprocessingDrawing" xmlns:w10="urn:schemas-microsoft-com:office:word" xmlns:w="http://schemas.openxmlformats.org/wordprocessingml/2006/main" xmlns:w14="http://schemas.microsoft.com/office/word/2010/wordml" xmlns:w15="http://schemas.microsoft.com/office/word/2012/wordml" xmlns:w16cex="http://schemas.microsoft.com/office/word/2018/wordml/cex" xmlns:w16cid="http://schemas.microsoft.com/office/word/2016/wordml/cid" xmlns:w16="http://schemas.microsoft.com/office/word/2018/wordml" xmlns:w16sdtdh="http://schemas.microsoft.com/office/word/2020/wordml/sdtdatahash" xmlns:w16se="http://schemas.microsoft.com/office/word/2015/wordml/symex" xmlns:wpg="http://schemas.microsoft.com/office/word/2010/wordprocessingGroup" xmlns:wpi="http://schemas.microsoft.com/office/word/2010/wordprocessingInk" xmlns:wne="http://schemas.microsoft.com/office/word/2006/wordml" xmlns:wps="http://schemas.microsoft.com/office/word/2010/wordprocessingShape" mc:Ignorable="w14 w15 w16se w16cid w16 w16cex w16sdtdh wp14">
+<w:endnotes xmlns:wpc="http://schemas.microsoft.com/office/word/2010/wordprocessingCanvas" xmlns:cx="http://schemas.microsoft.com/office/drawing/2014/chartex" xmlns:cx1="http://schemas.microsoft.com/office/drawing/2015/9/8/chartex" xmlns:cx2="http://schemas.microsoft.com/office/drawing/2015/10/21/chartex" xmlns:cx3="http://schemas.microsoft.com/office/drawing/2016/5/9/chartex" xmlns:cx4="http://schemas.microsoft.com/office/drawing/2016/5/10/chartex" xmlns:cx5="http://schemas.microsoft.com/office/drawing/2016/5/11/chartex" xmlns:cx6="http://schemas.microsoft.com/office/drawing/2016/5/12/chartex" xmlns:cx7="http://schemas.microsoft.com/office/drawing/2016/5/13/chartex" xmlns:cx8="http://schemas.microsoft.com/office/drawing/2016/5/14/chartex" xmlns:mc="http://schemas.openxmlformats.org/markup-compatibility/2006" xmlns:aink="http://schemas.microsoft.com/office/drawing/2016/ink" xmlns:am3d="http://schemas.microsoft.com/office/drawing/2017/model3d" xmlns:o="urn:schemas-microsoft-com:office:office" xmlns:oel="http://schemas.microsoft.com/office/2019/extlst" xmlns:r="http://schemas.openxmlformats.org/officeDocument/2006/relationships" xmlns:m="http://schemas.openxmlformats.org/officeDocument/2006/math" xmlns:v="urn:schemas-microsoft-com:vml" xmlns:wp14="http://schemas.microsoft.com/office/word/2010/wordprocessingDrawing" xmlns:wp="http://schemas.openxmlformats.org/drawingml/2006/wordprocessingDrawing" xmlns:w10="urn:schemas-microsoft-com:office:word" xmlns:w="http://schemas.openxmlformats.org/wordprocessingml/2006/main" xmlns:w14="http://schemas.microsoft.com/office/word/2010/wordml" xmlns:w15="http://schemas.microsoft.com/office/word/2012/wordml" xmlns:w16cex="http://schemas.microsoft.com/office/word/2018/wordml/cex" xmlns:w16cid="http://schemas.microsoft.com/office/word/2016/wordml/cid" xmlns:w16="http://schemas.microsoft.com/office/word/2018/wordml" xmlns:w16du="http://schemas.microsoft.com/office/word/2023/wordml/word16du" xmlns:w16sdtdh="http://schemas.microsoft.com/office/word/2020/wordml/sdtdatahash" xmlns:w16sdtfl="http://schemas.microsoft.com/office/word/2024/wordml/sdtformatlock" xmlns:w16se="http://schemas.microsoft.com/office/word/2015/wordml/symex" xmlns:wpg="http://schemas.microsoft.com/office/word/2010/wordprocessingGroup" xmlns:wpi="http://schemas.microsoft.com/office/word/2010/wordprocessingInk" xmlns:wne="http://schemas.microsoft.com/office/word/2006/wordml" xmlns:wps="http://schemas.microsoft.com/office/word/2010/wordprocessingShape" mc:Ignorable="w14 w15 w16se w16cid w16 w16cex w16sdtdh w16sdtfl w16du wp14">
   <w:endnote w:type="separator" w:id="-1">
     <w:p>
       <w:r>
@@ -693,7 +638,7 @@
 </file>
 
 <file path=word/footnotes.xml><?xml version="1.0" encoding="utf-8"?>
-<w:footnotes xmlns:wpc="http://schemas.microsoft.com/office/word/2010/wordprocessingCanvas" xmlns:cx="http://schemas.microsoft.com/office/drawing/2014/chartex" xmlns:cx1="http://schemas.microsoft.com/office/drawing/2015/9/8/chartex" xmlns:cx2="http://schemas.microsoft.com/office/drawing/2015/10/21/chartex" xmlns:cx3="http://schemas.microsoft.com/office/drawing/2016/5/9/chartex" xmlns:cx4="http://schemas.microsoft.com/office/drawing/2016/5/10/chartex" xmlns:cx5="http://schemas.microsoft.com/office/drawing/2016/5/11/chartex" xmlns:cx6="http://schemas.microsoft.com/office/drawing/2016/5/12/chartex" xmlns:cx7="http://schemas.microsoft.com/office/drawing/2016/5/13/chartex" xmlns:cx8="http://schemas.microsoft.com/office/drawing/2016/5/14/chartex" xmlns:mc="http://schemas.openxmlformats.org/markup-compatibility/2006" xmlns:aink="http://schemas.microsoft.com/office/drawing/2016/ink" xmlns:am3d="http://schemas.microsoft.com/office/drawing/2017/model3d" xmlns:o="urn:schemas-microsoft-com:office:office" xmlns:r="http://schemas.openxmlformats.org/officeDocument/2006/relationships" xmlns:m="http://schemas.openxmlformats.org/officeDocument/2006/math" xmlns:v="urn:schemas-microsoft-com:vml" xmlns:wp14="http://schemas.microsoft.com/office/word/2010/wordprocessingDrawing" xmlns:wp="http://schemas.openxmlformats.org/drawingml/2006/wordprocessingDrawing" xmlns:w10="urn:schemas-microsoft-com:office:word" xmlns:w="http://schemas.openxmlformats.org/wordprocessingml/2006/main" xmlns:w14="http://schemas.microsoft.com/office/word/2010/wordml" xmlns:w15="http://schemas.microsoft.com/office/word/2012/wordml" xmlns:w16cex="http://schemas.microsoft.com/office/word/2018/wordml/cex" xmlns:w16cid="http://schemas.microsoft.com/office/word/2016/wordml/cid" xmlns:w16="http://schemas.microsoft.com/office/word/2018/wordml" xmlns:w16sdtdh="http://schemas.microsoft.com/office/word/2020/wordml/sdtdatahash" xmlns:w16se="http://schemas.microsoft.com/office/word/2015/wordml/symex" xmlns:wpg="http://schemas.microsoft.com/office/word/2010/wordprocessingGroup" xmlns:wpi="http://schemas.microsoft.com/office/word/2010/wordprocessingInk" xmlns:wne="http://schemas.microsoft.com/office/word/2006/wordml" xmlns:wps="http://schemas.microsoft.com/office/word/2010/wordprocessingShape" mc:Ignorable="w14 w15 w16se w16cid w16 w16cex w16sdtdh wp14">
+<w:footnotes xmlns:wpc="http://schemas.microsoft.com/office/word/2010/wordprocessingCanvas" xmlns:cx="http://schemas.microsoft.com/office/drawing/2014/chartex" xmlns:cx1="http://schemas.microsoft.com/office/drawing/2015/9/8/chartex" xmlns:cx2="http://schemas.microsoft.com/office/drawing/2015/10/21/chartex" xmlns:cx3="http://schemas.microsoft.com/office/drawing/2016/5/9/chartex" xmlns:cx4="http://schemas.microsoft.com/office/drawing/2016/5/10/chartex" xmlns:cx5="http://schemas.microsoft.com/office/drawing/2016/5/11/chartex" xmlns:cx6="http://schemas.microsoft.com/office/drawing/2016/5/12/chartex" xmlns:cx7="http://schemas.microsoft.com/office/drawing/2016/5/13/chartex" xmlns:cx8="http://schemas.microsoft.com/office/drawing/2016/5/14/chartex" xmlns:mc="http://schemas.openxmlformats.org/markup-compatibility/2006" xmlns:aink="http://schemas.microsoft.com/office/drawing/2016/ink" xmlns:am3d="http://schemas.microsoft.com/office/drawing/2017/model3d" xmlns:o="urn:schemas-microsoft-com:office:office" xmlns:oel="http://schemas.microsoft.com/office/2019/extlst" xmlns:r="http://schemas.openxmlformats.org/officeDocument/2006/relationships" xmlns:m="http://schemas.openxmlformats.org/officeDocument/2006/math" xmlns:v="urn:schemas-microsoft-com:vml" xmlns:wp14="http://schemas.microsoft.com/office/word/2010/wordprocessingDrawing" xmlns:wp="http://schemas.openxmlformats.org/drawingml/2006/wordprocessingDrawing" xmlns:w10="urn:schemas-microsoft-com:office:word" xmlns:w="http://schemas.openxmlformats.org/wordprocessingml/2006/main" xmlns:w14="http://schemas.microsoft.com/office/word/2010/wordml" xmlns:w15="http://schemas.microsoft.com/office/word/2012/wordml" xmlns:w16cex="http://schemas.microsoft.com/office/word/2018/wordml/cex" xmlns:w16cid="http://schemas.microsoft.com/office/word/2016/wordml/cid" xmlns:w16="http://schemas.microsoft.com/office/word/2018/wordml" xmlns:w16du="http://schemas.microsoft.com/office/word/2023/wordml/word16du" xmlns:w16sdtdh="http://schemas.microsoft.com/office/word/2020/wordml/sdtdatahash" xmlns:w16sdtfl="http://schemas.microsoft.com/office/word/2024/wordml/sdtformatlock" xmlns:w16se="http://schemas.microsoft.com/office/word/2015/wordml/symex" xmlns:wpg="http://schemas.microsoft.com/office/word/2010/wordprocessingGroup" xmlns:wpi="http://schemas.microsoft.com/office/word/2010/wordprocessingInk" xmlns:wne="http://schemas.microsoft.com/office/word/2006/wordml" xmlns:wps="http://schemas.microsoft.com/office/word/2010/wordprocessingShape" mc:Ignorable="w14 w15 w16se w16cid w16 w16cex w16sdtdh w16sdtfl w16du wp14">
   <w:footnote w:type="separator" w:id="-1">
     <w:p>
       <w:r>
@@ -711,267 +656,8 @@
 </w:footnotes>
 </file>
 
-<file path=word/header1.xml><?xml version="1.0" encoding="utf-8"?>
-<w:hdr xmlns:wpc="http://schemas.microsoft.com/office/word/2010/wordprocessingCanvas" xmlns:cx="http://schemas.microsoft.com/office/drawing/2014/chartex" xmlns:cx1="http://schemas.microsoft.com/office/drawing/2015/9/8/chartex" xmlns:cx2="http://schemas.microsoft.com/office/drawing/2015/10/21/chartex" xmlns:cx3="http://schemas.microsoft.com/office/drawing/2016/5/9/chartex" xmlns:cx4="http://schemas.microsoft.com/office/drawing/2016/5/10/chartex" xmlns:cx5="http://schemas.microsoft.com/office/drawing/2016/5/11/chartex" xmlns:cx6="http://schemas.microsoft.com/office/drawing/2016/5/12/chartex" xmlns:cx7="http://schemas.microsoft.com/office/drawing/2016/5/13/chartex" xmlns:cx8="http://schemas.microsoft.com/office/drawing/2016/5/14/chartex" xmlns:mc="http://schemas.openxmlformats.org/markup-compatibility/2006" xmlns:aink="http://schemas.microsoft.com/office/drawing/2016/ink" xmlns:am3d="http://schemas.microsoft.com/office/drawing/2017/model3d" xmlns:o="urn:schemas-microsoft-com:office:office" xmlns:r="http://schemas.openxmlformats.org/officeDocument/2006/relationships" xmlns:m="http://schemas.openxmlformats.org/officeDocument/2006/math" xmlns:v="urn:schemas-microsoft-com:vml" xmlns:wp14="http://schemas.microsoft.com/office/word/2010/wordprocessingDrawing" xmlns:wp="http://schemas.openxmlformats.org/drawingml/2006/wordprocessingDrawing" xmlns:w10="urn:schemas-microsoft-com:office:word" xmlns:w="http://schemas.openxmlformats.org/wordprocessingml/2006/main" xmlns:w14="http://schemas.microsoft.com/office/word/2010/wordml" xmlns:w15="http://schemas.microsoft.com/office/word/2012/wordml" xmlns:w16cex="http://schemas.microsoft.com/office/word/2018/wordml/cex" xmlns:w16cid="http://schemas.microsoft.com/office/word/2016/wordml/cid" xmlns:w16="http://schemas.microsoft.com/office/word/2018/wordml" xmlns:w16sdtdh="http://schemas.microsoft.com/office/word/2020/wordml/sdtdatahash" xmlns:w16se="http://schemas.microsoft.com/office/word/2015/wordml/symex" xmlns:wpg="http://schemas.microsoft.com/office/word/2010/wordprocessingGroup" xmlns:wpi="http://schemas.microsoft.com/office/word/2010/wordprocessingInk" xmlns:wne="http://schemas.microsoft.com/office/word/2006/wordml" xmlns:wps="http://schemas.microsoft.com/office/word/2010/wordprocessingShape" mc:Ignorable="w14 w15 w16se w16cid w16 w16cex w16sdtdh wp14">
-  <w:p>
-    <w:pPr>
-      <w:jc w:val="right"/>
-      <w:rPr>
-        <w:rFonts w:ascii="Century Gothic" w:eastAsia="Calibri" w:hAnsi="Century Gothic"/>
-        <w:sz w:val="16"/>
-        <w:szCs w:val="16"/>
-      </w:rPr>
-    </w:pPr>
-    <w:r>
-      <w:rPr>
-        <w:rFonts w:ascii="Times New Roman" w:hAnsi="Times New Roman"/>
-        <w:noProof/>
-      </w:rPr>
-      <w:drawing>
-        <wp:anchor distT="0" distB="0" distL="114300" distR="114300" simplePos="0" relativeHeight="251660288" behindDoc="1" locked="0" layoutInCell="1" allowOverlap="1" wp14:anchorId="044BCA71" wp14:editId="4C43A487">
-          <wp:simplePos x="0" y="0"/>
-          <wp:positionH relativeFrom="margin">
-            <wp:posOffset>-209550</wp:posOffset>
-          </wp:positionH>
-          <wp:positionV relativeFrom="page">
-            <wp:posOffset>401955</wp:posOffset>
-          </wp:positionV>
-          <wp:extent cx="790575" cy="765810"/>
-          <wp:effectExtent l="0" t="0" r="9525" b="0"/>
-          <wp:wrapTight wrapText="bothSides">
-            <wp:wrapPolygon edited="0">
-              <wp:start x="0" y="0"/>
-              <wp:lineTo x="0" y="20955"/>
-              <wp:lineTo x="21340" y="20955"/>
-              <wp:lineTo x="21340" y="0"/>
-              <wp:lineTo x="0" y="0"/>
-            </wp:wrapPolygon>
-          </wp:wrapTight>
-          <wp:docPr id="20" name="Picture 20"/>
-          <wp:cNvGraphicFramePr>
-            <a:graphicFrameLocks xmlns:a="http://schemas.openxmlformats.org/drawingml/2006/main" noChangeAspect="1"/>
-          </wp:cNvGraphicFramePr>
-          <a:graphic xmlns:a="http://schemas.openxmlformats.org/drawingml/2006/main">
-            <a:graphicData uri="http://schemas.openxmlformats.org/drawingml/2006/picture">
-              <pic:pic xmlns:pic="http://schemas.openxmlformats.org/drawingml/2006/picture">
-                <pic:nvPicPr>
-                  <pic:cNvPr id="1" name="Picture 1"/>
-                  <pic:cNvPicPr>
-                    <a:picLocks noChangeAspect="1" noChangeArrowheads="1"/>
-                  </pic:cNvPicPr>
-                </pic:nvPicPr>
-                <pic:blipFill>
-                  <a:blip r:embed="rId1">
-                    <a:extLst>
-                      <a:ext uri="{28A0092B-C50C-407E-A947-70E740481C1C}">
-                        <a14:useLocalDpi xmlns:a14="http://schemas.microsoft.com/office/drawing/2010/main" val="0"/>
-                      </a:ext>
-                    </a:extLst>
-                  </a:blip>
-                  <a:srcRect/>
-                  <a:stretch>
-                    <a:fillRect/>
-                  </a:stretch>
-                </pic:blipFill>
-                <pic:spPr>
-                  <a:xfrm>
-                    <a:off x="0" y="0"/>
-                    <a:ext cx="790575" cy="765810"/>
-                  </a:xfrm>
-                  <a:prstGeom prst="rect">
-                    <a:avLst/>
-                  </a:prstGeom>
-                  <a:noFill/>
-                  <a:ln>
-                    <a:noFill/>
-                  </a:ln>
-                </pic:spPr>
-              </pic:pic>
-            </a:graphicData>
-          </a:graphic>
-          <wp14:sizeRelH relativeFrom="margin">
-            <wp14:pctWidth>0</wp14:pctWidth>
-          </wp14:sizeRelH>
-          <wp14:sizeRelV relativeFrom="margin">
-            <wp14:pctHeight>0</wp14:pctHeight>
-          </wp14:sizeRelV>
-        </wp:anchor>
-      </w:drawing>
-    </w:r>
-    <w:r>
-      <w:rPr>
-        <w:rFonts w:ascii="Century Gothic" w:eastAsia="Calibri" w:hAnsi="Century Gothic"/>
-        <w:sz w:val="16"/>
-        <w:szCs w:val="16"/>
-      </w:rPr>
-      <w:t xml:space="preserve">             Phone No:    0194-2310144/2310060                   </w:t>
-    </w:r>
-  </w:p>
-  <w:p>
-    <w:pPr>
-      <w:jc w:val="right"/>
-      <w:rPr>
-        <w:rFonts w:ascii="Century Gothic" w:eastAsia="Calibri" w:hAnsi="Century Gothic"/>
-        <w:color w:val="FFFFFF"/>
-        <w:sz w:val="16"/>
-        <w:szCs w:val="16"/>
-      </w:rPr>
-    </w:pPr>
-    <w:r>
-      <w:rPr>
-        <w:rFonts w:ascii="Century Gothic" w:eastAsia="Calibri" w:hAnsi="Century Gothic"/>
-        <w:sz w:val="16"/>
-        <w:szCs w:val="16"/>
-      </w:rPr>
-      <w:t xml:space="preserve">Fax:  </w:t>
-    </w:r>
-    <w:proofErr w:type="gramStart"/>
-    <w:r>
-      <w:rPr>
-        <w:rFonts w:ascii="Century Gothic" w:eastAsia="Calibri" w:hAnsi="Century Gothic"/>
-        <w:sz w:val="16"/>
-        <w:szCs w:val="16"/>
-      </w:rPr>
-      <w:t xml:space="preserve">  :</w:t>
-    </w:r>
-    <w:proofErr w:type="gramEnd"/>
-    <w:r>
-      <w:rPr>
-        <w:rFonts w:ascii="Century Gothic" w:eastAsia="Calibri" w:hAnsi="Century Gothic"/>
-        <w:sz w:val="16"/>
-        <w:szCs w:val="16"/>
-      </w:rPr>
-      <w:t xml:space="preserve">   0194-2310144</w:t>
-    </w:r>
-  </w:p>
-  <w:p>
-    <w:pPr>
-      <w:ind w:left="720" w:hanging="436"/>
-      <w:contextualSpacing/>
-      <w:jc w:val="center"/>
-      <w:rPr>
-        <w:rFonts w:ascii="Algerian" w:eastAsia="Calibri" w:hAnsi="Algerian"/>
-        <w:b/>
-        <w:bCs/>
-        <w:sz w:val="28"/>
-        <w:szCs w:val="28"/>
-      </w:rPr>
-    </w:pPr>
-    <w:r>
-      <w:rPr>
-        <w:rFonts w:ascii="Algerian" w:eastAsia="Calibri" w:hAnsi="Algerian"/>
-        <w:b/>
-        <w:bCs/>
-        <w:sz w:val="28"/>
-        <w:szCs w:val="28"/>
-      </w:rPr>
-      <w:t>OFFICE OF THE PRINCIPAL,</w:t>
-    </w:r>
-  </w:p>
-  <w:p>
-    <w:pPr>
-      <w:ind w:left="720" w:hanging="436"/>
-      <w:contextualSpacing/>
-      <w:jc w:val="center"/>
-      <w:rPr>
-        <w:rFonts w:ascii="Algerian" w:eastAsia="Calibri" w:hAnsi="Algerian"/>
-        <w:b/>
-        <w:bCs/>
-        <w:sz w:val="28"/>
-        <w:szCs w:val="28"/>
-      </w:rPr>
-    </w:pPr>
-    <w:r>
-      <w:rPr>
-        <w:rFonts w:ascii="Algerian" w:eastAsia="Calibri" w:hAnsi="Algerian"/>
-        <w:b/>
-        <w:bCs/>
-        <w:sz w:val="28"/>
-        <w:szCs w:val="28"/>
-      </w:rPr>
-      <w:t>KASHMIR GOVT. POLYTECHNIC COLLEGE GOGJI BAGH SRINAGAR.</w:t>
-    </w:r>
-  </w:p>
-  <w:p>
-    <w:pPr>
-      <w:contextualSpacing/>
-      <w:rPr>
-        <w:sz w:val="20"/>
-        <w:szCs w:val="20"/>
-      </w:rPr>
-    </w:pPr>
-    <w:r>
-      <w:t xml:space="preserve">                    </w:t>
-    </w:r>
-    <w:hyperlink r:id="rId2" w:history="1">
-      <w:r>
-        <w:rPr>
-          <w:rStyle w:val="Hyperlink"/>
-          <w:rFonts w:ascii="Century Gothic" w:hAnsi="Century Gothic" w:cs="Calibri"/>
-          <w:sz w:val="20"/>
-          <w:szCs w:val="20"/>
-        </w:rPr>
-        <w:t>http://www.kgpsrinagar.edu.in.</w:t>
-      </w:r>
-    </w:hyperlink>
-  </w:p>
-  <w:p>
-    <w:pPr>
-      <w:contextualSpacing/>
-      <w:rPr>
-        <w:sz w:val="20"/>
-        <w:szCs w:val="20"/>
-      </w:rPr>
-    </w:pPr>
-    <w:r>
-      <w:rPr>
-        <w:sz w:val="20"/>
-        <w:szCs w:val="20"/>
-      </w:rPr>
-      <w:t xml:space="preserve">                      </w:t>
-    </w:r>
-    <w:r>
-      <w:rPr>
-        <w:sz w:val="20"/>
-        <w:szCs w:val="20"/>
-      </w:rPr>
-      <w:t xml:space="preserve">             </w:t>
-    </w:r>
-    <w:r>
-      <w:rPr>
-        <w:sz w:val="20"/>
-        <w:szCs w:val="20"/>
-      </w:rPr>
-      <w:t xml:space="preserve"> </w:t>
-    </w:r>
-    <w:r>
-      <w:rPr>
-        <w:sz w:val="20"/>
-        <w:szCs w:val="20"/>
-      </w:rPr>
-      <w:t xml:space="preserve">Email: </w:t>
-    </w:r>
-    <w:hyperlink r:id="rId3" w:history="1">
-      <w:r>
-        <w:rPr>
-          <w:rStyle w:val="Hyperlink"/>
-          <w:sz w:val="20"/>
-          <w:szCs w:val="20"/>
-        </w:rPr>
-        <w:t>kgpolysgr58@gmail.com</w:t>
-      </w:r>
-    </w:hyperlink>
-  </w:p>
-  <w:p>
-    <w:pPr>
-      <w:pStyle w:val="Header"/>
-    </w:pPr>
-  </w:p>
-</w:hdr>
-</file>
-
 <file path=word/numbering.xml><?xml version="1.0" encoding="utf-8"?>
-<w:numbering xmlns:wpc="http://schemas.microsoft.com/office/word/2010/wordprocessingCanvas" xmlns:cx="http://schemas.microsoft.com/office/drawing/2014/chartex" xmlns:cx1="http://schemas.microsoft.com/office/drawing/2015/9/8/chartex" xmlns:cx2="http://schemas.microsoft.com/office/drawing/2015/10/21/chartex" xmlns:cx3="http://schemas.microsoft.com/office/drawing/2016/5/9/chartex" xmlns:cx4="http://schemas.microsoft.com/office/drawing/2016/5/10/chartex" xmlns:cx5="http://schemas.microsoft.com/office/drawing/2016/5/11/chartex" xmlns:cx6="http://schemas.microsoft.com/office/drawing/2016/5/12/chartex" xmlns:cx7="http://schemas.microsoft.com/office/drawing/2016/5/13/chartex" xmlns:cx8="http://schemas.microsoft.com/office/drawing/2016/5/14/chartex" xmlns:mc="http://schemas.openxmlformats.org/markup-compatibility/2006" xmlns:aink="http://schemas.microsoft.com/office/drawing/2016/ink" xmlns:am3d="http://schemas.microsoft.com/office/drawing/2017/model3d" xmlns:o="urn:schemas-microsoft-com:office:office" xmlns:r="http://schemas.openxmlformats.org/officeDocument/2006/relationships" xmlns:m="http://schemas.openxmlformats.org/officeDocument/2006/math" xmlns:v="urn:schemas-microsoft-com:vml" xmlns:wp14="http://schemas.microsoft.com/office/word/2010/wordprocessingDrawing" xmlns:wp="http://schemas.openxmlformats.org/drawingml/2006/wordprocessingDrawing" xmlns:w10="urn:schemas-microsoft-com:office:word" xmlns:w="http://schemas.openxmlformats.org/wordprocessingml/2006/main" xmlns:w14="http://schemas.microsoft.com/office/word/2010/wordml" xmlns:w15="http://schemas.microsoft.com/office/word/2012/wordml" xmlns:w16cex="http://schemas.microsoft.com/office/word/2018/wordml/cex" xmlns:w16cid="http://schemas.microsoft.com/office/word/2016/wordml/cid" xmlns:w16="http://schemas.microsoft.com/office/word/2018/wordml" xmlns:w16sdtdh="http://schemas.microsoft.com/office/word/2020/wordml/sdtdatahash" xmlns:w16se="http://schemas.microsoft.com/office/word/2015/wordml/symex" xmlns:wpg="http://schemas.microsoft.com/office/word/2010/wordprocessingGroup" xmlns:wpi="http://schemas.microsoft.com/office/word/2010/wordprocessingInk" xmlns:wne="http://schemas.microsoft.com/office/word/2006/wordml" xmlns:wps="http://schemas.microsoft.com/office/word/2010/wordprocessingShape" mc:Ignorable="w14 w15 w16se w16cid w16 w16cex w16sdtdh wp14">
+<w:numbering xmlns:wpc="http://schemas.microsoft.com/office/word/2010/wordprocessingCanvas" xmlns:cx="http://schemas.microsoft.com/office/drawing/2014/chartex" xmlns:cx1="http://schemas.microsoft.com/office/drawing/2015/9/8/chartex" xmlns:cx2="http://schemas.microsoft.com/office/drawing/2015/10/21/chartex" xmlns:cx3="http://schemas.microsoft.com/office/drawing/2016/5/9/chartex" xmlns:cx4="http://schemas.microsoft.com/office/drawing/2016/5/10/chartex" xmlns:cx5="http://schemas.microsoft.com/office/drawing/2016/5/11/chartex" xmlns:cx6="http://schemas.microsoft.com/office/drawing/2016/5/12/chartex" xmlns:cx7="http://schemas.microsoft.com/office/drawing/2016/5/13/chartex" xmlns:cx8="http://schemas.microsoft.com/office/drawing/2016/5/14/chartex" xmlns:mc="http://schemas.openxmlformats.org/markup-compatibility/2006" xmlns:aink="http://schemas.microsoft.com/office/drawing/2016/ink" xmlns:am3d="http://schemas.microsoft.com/office/drawing/2017/model3d" xmlns:o="urn:schemas-microsoft-com:office:office" xmlns:oel="http://schemas.microsoft.com/office/2019/extlst" xmlns:r="http://schemas.openxmlformats.org/officeDocument/2006/relationships" xmlns:m="http://schemas.openxmlformats.org/officeDocument/2006/math" xmlns:v="urn:schemas-microsoft-com:vml" xmlns:wp14="http://schemas.microsoft.com/office/word/2010/wordprocessingDrawing" xmlns:wp="http://schemas.openxmlformats.org/drawingml/2006/wordprocessingDrawing" xmlns:w10="urn:schemas-microsoft-com:office:word" xmlns:w="http://schemas.openxmlformats.org/wordprocessingml/2006/main" xmlns:w14="http://schemas.microsoft.com/office/word/2010/wordml" xmlns:w15="http://schemas.microsoft.com/office/word/2012/wordml" xmlns:w16cex="http://schemas.microsoft.com/office/word/2018/wordml/cex" xmlns:w16cid="http://schemas.microsoft.com/office/word/2016/wordml/cid" xmlns:w16="http://schemas.microsoft.com/office/word/2018/wordml" xmlns:w16du="http://schemas.microsoft.com/office/word/2023/wordml/word16du" xmlns:w16sdtdh="http://schemas.microsoft.com/office/word/2020/wordml/sdtdatahash" xmlns:w16sdtfl="http://schemas.microsoft.com/office/word/2024/wordml/sdtformatlock" xmlns:w16se="http://schemas.microsoft.com/office/word/2015/wordml/symex" xmlns:wpg="http://schemas.microsoft.com/office/word/2010/wordprocessingGroup" xmlns:wpi="http://schemas.microsoft.com/office/word/2010/wordprocessingInk" xmlns:wne="http://schemas.microsoft.com/office/word/2006/wordml" xmlns:wps="http://schemas.microsoft.com/office/word/2010/wordprocessingShape" mc:Ignorable="w14 w15 w16se w16cid w16 w16cex w16sdtdh w16sdtfl w16du wp14">
   <w:abstractNum w:abstractNumId="0" w15:restartNumberingAfterBreak="0">
     <w:nsid w:val="FFFFFF7C"/>
     <w:multiLevelType w:val="singleLevel"/>
@@ -1970,62 +1656,62 @@
       </w:rPr>
     </w:lvl>
   </w:abstractNum>
-  <w:num w:numId="1">
+  <w:num w:numId="1" w16cid:durableId="586305227">
     <w:abstractNumId w:val="9"/>
   </w:num>
-  <w:num w:numId="2">
+  <w:num w:numId="2" w16cid:durableId="295109206">
     <w:abstractNumId w:val="7"/>
   </w:num>
-  <w:num w:numId="3">
+  <w:num w:numId="3" w16cid:durableId="1396858562">
     <w:abstractNumId w:val="6"/>
   </w:num>
-  <w:num w:numId="4">
+  <w:num w:numId="4" w16cid:durableId="1595480788">
     <w:abstractNumId w:val="5"/>
   </w:num>
-  <w:num w:numId="5">
+  <w:num w:numId="5" w16cid:durableId="1329406861">
     <w:abstractNumId w:val="4"/>
   </w:num>
-  <w:num w:numId="6">
+  <w:num w:numId="6" w16cid:durableId="1882399247">
     <w:abstractNumId w:val="8"/>
   </w:num>
-  <w:num w:numId="7">
+  <w:num w:numId="7" w16cid:durableId="71700912">
     <w:abstractNumId w:val="3"/>
   </w:num>
-  <w:num w:numId="8">
+  <w:num w:numId="8" w16cid:durableId="178350124">
     <w:abstractNumId w:val="2"/>
   </w:num>
-  <w:num w:numId="9">
+  <w:num w:numId="9" w16cid:durableId="394817934">
     <w:abstractNumId w:val="1"/>
   </w:num>
-  <w:num w:numId="10">
+  <w:num w:numId="10" w16cid:durableId="119302295">
     <w:abstractNumId w:val="0"/>
   </w:num>
-  <w:num w:numId="11">
+  <w:num w:numId="11" w16cid:durableId="1747070212">
     <w:abstractNumId w:val="12"/>
   </w:num>
-  <w:num w:numId="12">
+  <w:num w:numId="12" w16cid:durableId="1110079107">
     <w:abstractNumId w:val="13"/>
   </w:num>
-  <w:num w:numId="13">
+  <w:num w:numId="13" w16cid:durableId="557085504">
     <w:abstractNumId w:val="11"/>
   </w:num>
-  <w:num w:numId="14">
+  <w:num w:numId="14" w16cid:durableId="1743601459">
     <w:abstractNumId w:val="16"/>
   </w:num>
-  <w:num w:numId="15">
+  <w:num w:numId="15" w16cid:durableId="478688774">
     <w:abstractNumId w:val="14"/>
   </w:num>
-  <w:num w:numId="16">
+  <w:num w:numId="16" w16cid:durableId="1007438775">
     <w:abstractNumId w:val="15"/>
   </w:num>
-  <w:num w:numId="17">
+  <w:num w:numId="17" w16cid:durableId="1702124944">
     <w:abstractNumId w:val="10"/>
   </w:num>
 </w:numbering>
 </file>
 
 <file path=word/styles.xml><?xml version="1.0" encoding="utf-8"?>
-<w:styles xmlns:mc="http://schemas.openxmlformats.org/markup-compatibility/2006" xmlns:r="http://schemas.openxmlformats.org/officeDocument/2006/relationships" xmlns:w="http://schemas.openxmlformats.org/wordprocessingml/2006/main" xmlns:w14="http://schemas.microsoft.com/office/word/2010/wordml" xmlns:w15="http://schemas.microsoft.com/office/word/2012/wordml" xmlns:w16cex="http://schemas.microsoft.com/office/word/2018/wordml/cex" xmlns:w16cid="http://schemas.microsoft.com/office/word/2016/wordml/cid" xmlns:w16="http://schemas.microsoft.com/office/word/2018/wordml" xmlns:w16sdtdh="http://schemas.microsoft.com/office/word/2020/wordml/sdtdatahash" xmlns:w16se="http://schemas.microsoft.com/office/word/2015/wordml/symex" mc:Ignorable="w14 w15 w16se w16cid w16 w16cex w16sdtdh">
+<w:styles xmlns:mc="http://schemas.openxmlformats.org/markup-compatibility/2006" xmlns:r="http://schemas.openxmlformats.org/officeDocument/2006/relationships" xmlns:w="http://schemas.openxmlformats.org/wordprocessingml/2006/main" xmlns:w14="http://schemas.microsoft.com/office/word/2010/wordml" xmlns:w15="http://schemas.microsoft.com/office/word/2012/wordml" xmlns:w16cex="http://schemas.microsoft.com/office/word/2018/wordml/cex" xmlns:w16cid="http://schemas.microsoft.com/office/word/2016/wordml/cid" xmlns:w16="http://schemas.microsoft.com/office/word/2018/wordml" xmlns:w16du="http://schemas.microsoft.com/office/word/2023/wordml/word16du" xmlns:w16sdtdh="http://schemas.microsoft.com/office/word/2020/wordml/sdtdatahash" xmlns:w16sdtfl="http://schemas.microsoft.com/office/word/2024/wordml/sdtformatlock" xmlns:w16se="http://schemas.microsoft.com/office/word/2015/wordml/symex" mc:Ignorable="w14 w15 w16se w16cid w16 w16cex w16sdtdh w16sdtfl w16du">
   <w:docDefaults>
     <w:rPrDefault>
       <w:rPr>

</xml_diff>